<commit_message>
Print-prep citation pass: fix Johnson (unpublished; wrong cite), confirm Howard, add dockets
Track (b) reporter-citation confirmations:
- Johnson (Ch. 30): CORRECTED - unpublished memorandum opinion, no S.W.3d
  page; '151 S.W.3d 193' was a different defendant (Keithen Oneal Johnson).
  Now cited as No. 06-03-00235-CR, 2004 WL ___ (mem. op.).
- Howard (Ch. 39): CONFIRMED 300 So. 3d 1011 (Miss. 2020); dropped the hedge.
- Michael Peterson (Ch. 29): confirmed 361 N.C. 587, 652 S.E.2d 216 (already correct).
- LaBranche (Ch. 15): added docket No. 25-KA-184; noted So. 3d page likely
  not yet assigned (2025 WL slip).
- Barber (Ch. 20): added filing date (filed Jan 23, 2009); So. 3d page still
  pending a Westlaw lookup.
Rebuilt affected Word docs, master manuscript, and the chapter zip bundle.

Co-Authored-By: Claude Opus 4.8 <noreply@anthropic.com>
Claude-Session: https://claude.ai/code/session_016HAHAXcMmaZghEz1kJrDWU
</commit_message>
<xml_diff>
--- a/book/word/Chapter 15 - The Cameras on the Interstate.docx
+++ b/book/word/Chapter 15 - The Cameras on the Interstate.docx
@@ -495,13 +495,19 @@
         <w:t xml:space="preserve">State v. LaBranche</w:t>
       </w:r>
       <w:r>
-        <w:t xml:space="preserve">, Court of Appeal of</w:t>
-      </w:r>
-      <w:r>
-        <w:t xml:space="preserve"> </w:t>
-      </w:r>
-      <w:r>
-        <w:t xml:space="preserve">Louisiana, Fifth Circuit (2025); FindLaw case ID 118267251.</w:t>
+        <w:t xml:space="preserve">, No. 25-KA-184 (La. App. 5</w:t>
+      </w:r>
+      <w:r>
+        <w:t xml:space="preserve"> </w:t>
+      </w:r>
+      <w:r>
+        <w:t xml:space="preserve">Cir. 2025), Court of Appeal of Louisiana, Fifth Circuit; FindLaw case ID</w:t>
+      </w:r>
+      <w:r>
+        <w:t xml:space="preserve"> </w:t>
+      </w:r>
+      <w:r>
+        <w:t xml:space="preserve">118267251.</w:t>
       </w:r>
       <w:r>
         <w:t xml:space="preserve"> </w:t>
@@ -539,13 +545,19 @@
         <w:t xml:space="preserve"> </w:t>
       </w:r>
       <w:r>
-        <w:t xml:space="preserve">opinion. (Confirm the exact So. 3d reporter citation before print; cite by court</w:t>
-      </w:r>
-      <w:r>
-        <w:t xml:space="preserve"> </w:t>
-      </w:r>
-      <w:r>
-        <w:t xml:space="preserve">and FindLaw ID until then.)</w:t>
+        <w:t xml:space="preserve">opinion. (Citation note: cite by docket No. 25-KA-184 for now; because the</w:t>
+      </w:r>
+      <w:r>
+        <w:t xml:space="preserve"> </w:t>
+      </w:r>
+      <w:r>
+        <w:t xml:space="preserve">opinion is from late 2025, a bound So. 3d page has likely not been assigned yet</w:t>
+      </w:r>
+      <w:r>
+        <w:t xml:space="preserve"> </w:t>
+      </w:r>
+      <w:r>
+        <w:t xml:space="preserve">and it may exist only as a 2025 WL slip cite. Confirm before print.)</w:t>
       </w:r>
     </w:p>
     <w:bookmarkEnd w:id="23"/>

</xml_diff>